<commit_message>
feat: implement NASA-TLX survey component and API endpoint for user workload data collection
</commit_message>
<xml_diff>
--- a/data/2nd test/Phase_2_Demographics_Performance_Analysis.docx
+++ b/data/2nd test/Phase_2_Demographics_Performance_Analysis.docx
@@ -12,7 +12,7 @@
     </w:p>
     <w:p>
       <w:r>
-        <w:t>*Thời gian xuất báo cáo: 17:51:25 8/8/2026 (Giờ Việt Nam)*</w:t>
+        <w:t>*Thời gian xuất báo cáo: 14:13:33 9/8/2026 (Giờ Việt Nam)*</w:t>
       </w:r>
     </w:p>
     <w:p>
@@ -28,7 +28,7 @@
         <w:rPr>
           <w:b/>
         </w:rPr>
-        <w:t>Hạn chế cỡ mẫu nhỏ &amp; Đồng nhất nhóm tuổi tác (Research Limitations)</w:t>
+        <w:t>Hạn chế thực nghiệm &amp; Cỡ mẫu nhỏ (Research Limitations)</w:t>
       </w:r>
       <w:r>
         <w:t>:</w:t>
@@ -45,7 +45,7 @@
         <w:t>Kháng nghị tính chắc chắn</w:t>
       </w:r>
       <w:r>
-        <w:t xml:space="preserve">: Do cỡ mẫu hiện tại vẫn còn nhỏ (nếu dưới 60), tất cả các tỷ lệ phần trăm (%) hiển thị trong báo cáo này chỉ mang tính chất </w:t>
+        <w:t xml:space="preserve">: Do cỡ mẫu hiện tại vẫn đang tích lũy (mục tiêu sàn N &gt;= 40), tất cả các tỷ lệ phần trăm (%) hiển thị trong báo cáo này chỉ mang tính chất </w:t>
       </w:r>
       <w:r>
         <w:rPr>
@@ -54,7 +54,7 @@
         <w:t>gợi mở xu hướng (exploratory)</w:t>
       </w:r>
       <w:r>
-        <w:t>, tuyệt đối không được trích dẫn như một kết luận cứng cho đến khi hoàn thành toàn bộ thực nghiệm và chạy kiểm định mô hình GEE/GLMM.</w:t>
+        <w:t>.</w:t>
       </w:r>
     </w:p>
     <w:p>
@@ -68,7 +68,21 @@
         <w:t>Đồng nhất nhân khẩu học</w:t>
       </w:r>
       <w:r>
-        <w:t>: Dữ liệu ghi nhận hơn 90% đối tượng tham gia là sinh viên trong độ tuổi 18-22. Đây là một hạn chế rõ rệt về mặt nhân khẩu học (Demographic Homogeneity Limitation) cần được khai báo trong phần thảo luận (Discussion) của khóa luận.</w:t>
+        <w:t>: Dữ liệu ghi nhận hơn 90% đối tượng tham gia là sinh viên trong độ tuổi 18-22 (Demographic Homogeneity Limitation).</w:t>
+      </w:r>
+    </w:p>
+    <w:p>
+      <w:r>
+        <w:t xml:space="preserve">&gt; 3. </w:t>
+      </w:r>
+      <w:r>
+        <w:rPr>
+          <w:b/>
+        </w:rPr>
+        <w:t>Mơ hồ nhận thức từ nhãn nút bấm (Cognitive Inversion)</w:t>
+      </w:r>
+      <w:r>
+        <w:t>: Việc dán nhãn nút quyết định là "Đồng ý/Từ chối đề xuất của AI" có thể đã gây ra đảo ngược nhận thức vô ý trên một số câu bẫy.</w:t>
       </w:r>
     </w:p>
     <w:p>
@@ -84,7 +98,7 @@
         <w:rPr>
           <w:b/>
         </w:rPr>
-        <w:t>Cơ chế Lọc Dữ liệu Rác (Post-Hoc Data Cleaning)</w:t>
+        <w:t>Cơ chế Lọc 5 Tầng (5-Tier Data Filtering Algorithm)</w:t>
       </w:r>
       <w:r>
         <w:t>:</w:t>
@@ -92,7 +106,7 @@
     </w:p>
     <w:p>
       <w:r>
-        <w:t>&gt; Báo cáo này áp dụng bộ lọc tự động để loại bỏ các ca làm ẩu (Speedrun &lt; 2.0 giây/câu hoặc chọn trùng một lựa chọn liên tục $ge 19/20$ câu). Tổng cộng đã làm sạch mẫu để đo lường năng lực thực sự của đối tượng tham gia.</w:t>
+        <w:t>&gt; Báo cáo này áp dụng bộ lọc tự động 5 tầng để loại bỏ triệt để hiện tượng sụp đổ nhận thức (Collapse Point) và làm ẩu. Dữ liệu được tính toán trên các phản hồi HỢP LỆ từ 26 người dùng sạch.</w:t>
       </w:r>
     </w:p>
     <w:p>
@@ -116,11 +130,6 @@
     </w:p>
     <w:p>
       <w:r>
-        <w:t>*Đánh giá xem lĩnh vực học tập và làm việc có tạo nên sự khác biệt về sự hoài nghi lành mạnh với AI hay không.*</w:t>
-      </w:r>
-    </w:p>
-    <w:p>
-      <w:r>
         <w:t>| Nhóm Nghề nghiệp | Số lượng (n) | Thời gian ra quyết định trung bình | Tỷ lệ phát hiện lỗi AI (Bẫy) | Tải lượng nhận thức trung bình (NASA-TLX) |</w:t>
       </w:r>
     </w:p>
@@ -137,10 +146,19 @@
         <w:rPr>
           <w:b/>
         </w:rPr>
-        <w:t>Sinh viên - Kỹ thuật / CNTT</w:t>
+        <w:t>STEM / Công nghệ (Tech/IT)</w:t>
       </w:r>
       <w:r>
-        <w:t xml:space="preserve"> | 11 | 11.81s | 24% | 3.82 |</w:t>
+        <w:t xml:space="preserve"> | 11 | 12.65s | </w:t>
+      </w:r>
+      <w:r>
+        <w:rPr>
+          <w:b/>
+        </w:rPr>
+        <w:t>19%</w:t>
+      </w:r>
+      <w:r>
+        <w:t xml:space="preserve"> | 0.00 |</w:t>
       </w:r>
     </w:p>
     <w:p>
@@ -151,10 +169,19 @@
         <w:rPr>
           <w:b/>
         </w:rPr>
-        <w:t>Sinh viên - Kinh tế / Quản trị</w:t>
+        <w:t>Kinh tế / Tài chính / Ngân hàng</w:t>
       </w:r>
       <w:r>
-        <w:t xml:space="preserve"> | 4 | 3.83s | 21% | 3.50 |</w:t>
+        <w:t xml:space="preserve"> | 1 | 24.12s | </w:t>
+      </w:r>
+      <w:r>
+        <w:rPr>
+          <w:b/>
+        </w:rPr>
+        <w:t>17%</w:t>
+      </w:r>
+      <w:r>
+        <w:t xml:space="preserve"> | 0.00 |</w:t>
       </w:r>
     </w:p>
     <w:p>
@@ -165,38 +192,19 @@
         <w:rPr>
           <w:b/>
         </w:rPr>
-        <w:t>Sinh viên - Các khối ngành khác</w:t>
+        <w:t>Khác (Xã hội / Sức khỏe / Nghệ thuật)</w:t>
       </w:r>
       <w:r>
-        <w:t xml:space="preserve"> | 4 | 13.10s | 29% | 3.75 |</w:t>
-      </w:r>
-    </w:p>
-    <w:p>
-      <w:r>
-        <w:t xml:space="preserve">| </w:t>
+        <w:t xml:space="preserve"> | 14 | 29.81s | </w:t>
       </w:r>
       <w:r>
         <w:rPr>
           <w:b/>
         </w:rPr>
-        <w:t>Người đi làm (Employed)</w:t>
+        <w:t>23%</w:t>
       </w:r>
       <w:r>
-        <w:t xml:space="preserve"> | 2 | 9.78s | 25% | 3.50 |</w:t>
-      </w:r>
-    </w:p>
-    <w:p>
-      <w:r>
-        <w:t xml:space="preserve">| </w:t>
-      </w:r>
-      <w:r>
-        <w:rPr>
-          <w:b/>
-        </w:rPr>
-        <w:t>Tự do / Khác</w:t>
-      </w:r>
-      <w:r>
-        <w:t xml:space="preserve"> | 2 | 21.04s | 33% | 3.50 |</w:t>
+        <w:t xml:space="preserve"> | 0.00 |</w:t>
       </w:r>
     </w:p>
     <w:p>
@@ -215,17 +223,12 @@
         <w:pStyle w:val="Heading2"/>
       </w:pPr>
       <w:r>
-        <w:t>2. Phân tích theo Tần suất tiếp xúc Công nghệ AI (AI Exposure Analysis)</w:t>
+        <w:t>2. Phân tích theo Tần suất Sử dụng AI (AI Experience Exposure)</w:t>
       </w:r>
     </w:p>
     <w:p>
       <w:r>
-        <w:t>*Phân tích xem mức độ quen thuộc với các công cụ AI (ChatGPT, Gemini) có giúp người dùng tránh được thiên kiến tự động hóa hay không.*</w:t>
-      </w:r>
-    </w:p>
-    <w:p>
-      <w:r>
-        <w:t>| Mức độ tiếp xúc AI | Số lượng (n) | Thời gian ra quyết định trung bình | Tỷ lệ phát hiện lỗi AI (Bẫy) | Tải lượng nhận thức trung bình (NASA-TLX) |</w:t>
+        <w:t>| Tần suất Sử dụng AI | Số lượng (n) | Thời gian ra quyết định trung bình | Tỷ lệ phát hiện lỗi AI (Bẫy) | Tải lượng nhận thức trung bình (NASA-TLX) |</w:t>
       </w:r>
     </w:p>
     <w:p>
@@ -241,10 +244,19 @@
         <w:rPr>
           <w:b/>
         </w:rPr>
-        <w:t>Hàng ngày (Daily)</w:t>
+        <w:t>Hàng ngày / Thường xuyên</w:t>
       </w:r>
       <w:r>
-        <w:t xml:space="preserve"> | 9 | 11.04s | 28% | 3.89 |</w:t>
+        <w:t xml:space="preserve"> | 15 | 14.51s | </w:t>
+      </w:r>
+      <w:r>
+        <w:rPr>
+          <w:b/>
+        </w:rPr>
+        <w:t>20%</w:t>
+      </w:r>
+      <w:r>
+        <w:t xml:space="preserve"> | 0.00 |</w:t>
       </w:r>
     </w:p>
     <w:p>
@@ -255,10 +267,19 @@
         <w:rPr>
           <w:b/>
         </w:rPr>
-        <w:t>Thường xuyên (Weekly)</w:t>
+        <w:t>Thỉnh thoảng / Đôi khi</w:t>
       </w:r>
       <w:r>
-        <w:t xml:space="preserve"> | 6 | 11.05s | 22% | 4.33 |</w:t>
+        <w:t xml:space="preserve"> | 6 | 15.17s | </w:t>
+      </w:r>
+      <w:r>
+        <w:rPr>
+          <w:b/>
+        </w:rPr>
+        <w:t>33%</w:t>
+      </w:r>
+      <w:r>
+        <w:t xml:space="preserve"> | 0.00 |</w:t>
       </w:r>
     </w:p>
     <w:p>
@@ -269,24 +290,19 @@
         <w:rPr>
           <w:b/>
         </w:rPr>
-        <w:t>Thỉnh thoảng (Occasionally)</w:t>
+        <w:t>Hiếm khi / Chưa bao giờ</w:t>
       </w:r>
       <w:r>
-        <w:t xml:space="preserve"> | 5 | 9.95s | 30% | 2.80 |</w:t>
-      </w:r>
-    </w:p>
-    <w:p>
-      <w:r>
-        <w:t xml:space="preserve">| </w:t>
+        <w:t xml:space="preserve"> | 5 | 54.62s | </w:t>
       </w:r>
       <w:r>
         <w:rPr>
           <w:b/>
         </w:rPr>
-        <w:t>Hiếm khi (Rarely/Never)</w:t>
+        <w:t>7%</w:t>
       </w:r>
       <w:r>
-        <w:t xml:space="preserve"> | 2 | 15.20s | 17% | 3.50 |</w:t>
+        <w:t xml:space="preserve"> | 0.00 |</w:t>
       </w:r>
     </w:p>
     <w:p>
@@ -305,17 +321,12 @@
         <w:pStyle w:val="Heading2"/>
       </w:pPr>
       <w:r>
-        <w:t>3. Phân tích theo Thiết bị Thực nghiệm (Device Impact Analysis)</w:t>
+        <w:t>3. Phân tích theo Loại Thiết bị Thực nghiệm (Device Impact Analysis)</w:t>
       </w:r>
     </w:p>
     <w:p>
       <w:r>
-        <w:t>*Màn hình nhỏ trên thiết bị di động có làm ảnh hưởng đến khả năng làm câu hỏi của người dùng?*</w:t>
-      </w:r>
-    </w:p>
-    <w:p>
-      <w:r>
-        <w:t>| Thiết bị sử dụng | Số lượng (n) | Thời gian ra quyết định trung bình | Tỷ lệ phát hiện lỗi AI (Bẫy) | Tải lượng nhận thức trung bình (NASA-TLX) |</w:t>
+        <w:t>| Loại Thiết bị | Số lượng (n) | Thời gian ra quyết định trung bình | Tỷ lệ phát hiện lỗi AI (Bẫy) | Tải lượng nhận thức trung bình (NASA-TLX) |</w:t>
       </w:r>
     </w:p>
     <w:p>
@@ -334,7 +345,16 @@
         <w:t>Desktop / Laptop</w:t>
       </w:r>
       <w:r>
-        <w:t xml:space="preserve"> | 9 | 8.77s | 31% | 4.22 |</w:t>
+        <w:t xml:space="preserve"> | 15 | 25.23s | </w:t>
+      </w:r>
+      <w:r>
+        <w:rPr>
+          <w:b/>
+        </w:rPr>
+        <w:t>20%</w:t>
+      </w:r>
+      <w:r>
+        <w:t xml:space="preserve"> | 0.00 |</w:t>
       </w:r>
     </w:p>
     <w:p>
@@ -348,7 +368,16 @@
         <w:t>Mobile / Phone</w:t>
       </w:r>
       <w:r>
-        <w:t xml:space="preserve"> | 13 | 12.84s | 22% | 3.38 |</w:t>
+        <w:t xml:space="preserve"> | 11 | 19.12s | </w:t>
+      </w:r>
+      <w:r>
+        <w:rPr>
+          <w:b/>
+        </w:rPr>
+        <w:t>21%</w:t>
+      </w:r>
+      <w:r>
+        <w:t xml:space="preserve"> | 0.00 |</w:t>
       </w:r>
     </w:p>
     <w:p>
@@ -367,17 +396,12 @@
         <w:pStyle w:val="Heading2"/>
       </w:pPr>
       <w:r>
-        <w:t>4. Phân tích theo Nhóm Giao diện (Experimental Interface Comparison)</w:t>
+        <w:t>4. Bảng So sánh Hiệu năng theo Nhóm Giao diện (Interface Group Performance)</w:t>
       </w:r>
     </w:p>
     <w:p>
       <w:r>
-        <w:t>*Nhắc lại tương quan cốt lõi của nghiên cứu để đối chiếu.*</w:t>
-      </w:r>
-    </w:p>
-    <w:p>
-      <w:r>
-        <w:t>| Nhóm Giao diện | Số lượng (n) | Thời gian ra quyết định trung bình | Tỷ lệ phát hiện lỗi AI (Bẫy) | Tải lượng nhận thức trung bình (NASA-TLX) |</w:t>
+        <w:t>| Nhóm Giao diện | Số lượng hợp lệ (n) | Thời gian ra quyết định / câu | Tỷ lệ phát hiện lỗi AI (Bẫy) | Tải lượng nhận thức trung bình (NASA-TLX) |</w:t>
       </w:r>
     </w:p>
     <w:p>
@@ -396,7 +420,16 @@
         <w:t>Nhóm A (Black-box)</w:t>
       </w:r>
       <w:r>
-        <w:t xml:space="preserve"> | 6 | 8.64s | 31% | 4.33 |</w:t>
+        <w:t xml:space="preserve"> | 11 | 21.50s | </w:t>
+      </w:r>
+      <w:r>
+        <w:rPr>
+          <w:b/>
+        </w:rPr>
+        <w:t>23%</w:t>
+      </w:r>
+      <w:r>
+        <w:t xml:space="preserve"> | 0.00 |</w:t>
       </w:r>
     </w:p>
     <w:p>
@@ -410,7 +443,16 @@
         <w:t>Nhóm B (Static XAI)</w:t>
       </w:r>
       <w:r>
-        <w:t xml:space="preserve"> | 9 | 11.21s | 26% | 3.22 |</w:t>
+        <w:t xml:space="preserve"> | 9 | 21.76s | </w:t>
+      </w:r>
+      <w:r>
+        <w:rPr>
+          <w:b/>
+        </w:rPr>
+        <w:t>23%</w:t>
+      </w:r>
+      <w:r>
+        <w:t xml:space="preserve"> | 0.00 |</w:t>
       </w:r>
     </w:p>
     <w:p>
@@ -424,60 +466,16 @@
         <w:t>Nhóm C (Interactive XAI)</w:t>
       </w:r>
       <w:r>
-        <w:t xml:space="preserve"> | 7 | 13.30s | 21% | 3.86 |</w:t>
-      </w:r>
-    </w:p>
-    <w:p>
-      <w:pPr>
-        <w:jc w:val="center"/>
-      </w:pPr>
-      <w:r>
-        <w:rPr>
-          <w:color w:val="B4B4B4"/>
-        </w:rPr>
-        <w:t>__________________________________________________</w:t>
-      </w:r>
-    </w:p>
-    <w:p>
-      <w:pPr>
-        <w:pStyle w:val="Heading2"/>
-      </w:pPr>
-      <w:r>
-        <w:t>5. Đánh giá Khả năng giải quyết bẫy lỗi của AI (Trap Scenarios Deep Dive)</w:t>
-      </w:r>
-    </w:p>
-    <w:p>
-      <w:pPr>
-        <w:pStyle w:val="ListBullet"/>
-      </w:pPr>
-      <w:r>
-        <w:t xml:space="preserve">  </w:t>
+        <w:t xml:space="preserve"> | 6 | 25.83s | </w:t>
       </w:r>
       <w:r>
         <w:rPr>
           <w:b/>
         </w:rPr>
-        <w:t>Tỷ lệ bác bỏ bẫy sai chung</w:t>
+        <w:t>14%</w:t>
       </w:r>
       <w:r>
-        <w:t>: Hệ thống ghi nhận mức độ tỉnh táo trước bẫy lỗi của AI có sự phân hóa mạnh mẽ dựa trên việc giao diện có cung cấp XAI hay không.</w:t>
-      </w:r>
-    </w:p>
-    <w:p>
-      <w:pPr>
-        <w:pStyle w:val="ListBullet"/>
-      </w:pPr>
-      <w:r>
-        <w:t xml:space="preserve">  </w:t>
-      </w:r>
-      <w:r>
-        <w:rPr>
-          <w:b/>
-        </w:rPr>
-        <w:t>Ảnh hưởng chéo</w:t>
-      </w:r>
-      <w:r>
-        <w:t>: Việc kết hợp chuyên ngành Kỹ thuật và giao diện XAI tương tác (Nhóm C) tạo ra nhóm đối tượng có hiệu năng thẩm định tối ưu nhất, trong khi nhóm không chuyên ngành Kỹ thuật nằm ở nhóm A có tỷ lệ Automation Bias chạm mức báo động.</w:t>
+        <w:t xml:space="preserve"> | 0.00 |</w:t>
       </w:r>
     </w:p>
     <w:p>
@@ -539,7 +537,7 @@
         <w:t>Trách nhiệm khoa học &amp; Ý tưởng chủ đạo</w:t>
       </w:r>
       <w:r>
-        <w:t>: Toàn bộ thiết kế thực nghiệm, định hướng nghiên cứu, thu thập dữ liệu thực tế, các phát hiện định tính về giao diện (bao gồm các quan sát về sự mơ hồ trong tương tác giao diện) và việc chịu trách nhiệm khoa học/bảo vệ kết quả nghiên cứu hoàn toàn thuộc về tác giả khóa luận (con người).</w:t>
+        <w:t>: Toàn bộ thiết kế thực nghiệm, định hướng nghiên cứu, thu thập dữ liệu thực tế, các phát hiện định tính về giao diện và việc chịu trách nhiệm khoa học hoàn toàn thuộc về tác giả khóa luận.</w:t>
       </w:r>
     </w:p>
     <w:sectPr>

</xml_diff>